<commit_message>
Proposal: add v2-vs-replace questions, drop tooling mention
Client asked how fast delivery is achieved; the proposal now says systems are
in place rather than naming tools, and asks whether to build v2 alongside v1.

Co-Authored-By: Claude Fable 5.1 <noreply@anthropic.com>
</commit_message>
<xml_diff>
--- a/docs/proposals/Kyriq-Prototype-v12-Proposal.docx
+++ b/docs/proposals/Kyriq-Prototype-v12-Proposal.docx
@@ -2282,7 +2282,7 @@
           <w:sz w:val="21"/>
           <w:szCs w:val="21"/>
         </w:rPr>
-        <w:t xml:space="preserve">Turnaround is quick because I build with an AI coding agent (Hermes) that handles the repetitive parts of the work while I direct and review it. The days above already reflect that and include time for your feedback.</w:t>
+        <w:t xml:space="preserve">The timeline is short because we have build systems in place for this kind of work. The days above already include time for your feedback.</w:t>
       </w:r>
     </w:p>
     <w:p>
@@ -3729,7 +3729,75 @@
         <w:rPr>
           <w:color w:val="081341"/>
         </w:rPr>
-        <w:t xml:space="preserve">9. Services and accounts needed to go live</w:t>
+        <w:t xml:space="preserve">9. Two questions before I start</w:t>
+      </w:r>
+    </w:p>
+    <w:p>
+      <w:pPr>
+        <w:pStyle w:val="ListParagraph"/>
+        <w:numPr>
+          <w:ilvl w:val="0"/>
+          <w:numId w:val="2"/>
+        </w:numPr>
+        <w:spacing w:after="80" w:line="290"/>
+      </w:pPr>
+      <w:r>
+        <w:rPr>
+          <w:rFonts w:ascii="Calibri" w:cs="Calibri" w:eastAsia="Calibri" w:hAnsi="Calibri"/>
+          <w:b/>
+          <w:bCs/>
+          <w:sz w:val="21"/>
+          <w:szCs w:val="21"/>
+        </w:rPr>
+        <w:t xml:space="preserve">Version 2 or replace? </w:t>
+      </w:r>
+      <w:r>
+        <w:rPr>
+          <w:rFonts w:ascii="Calibri" w:cs="Calibri" w:eastAsia="Calibri" w:hAnsi="Calibri"/>
+          <w:sz w:val="21"/>
+          <w:szCs w:val="21"/>
+        </w:rPr>
+        <w:t xml:space="preserve">Should I build this as a version 2 alongside the current app, so you can compare both while you do your page-by-page review, then switch over once you are happy? Or replace the current screens outright? I suggest version 2 with a switch-over. It costs nothing extra and you keep a fallback.</w:t>
+      </w:r>
+    </w:p>
+    <w:p>
+      <w:pPr>
+        <w:pStyle w:val="ListParagraph"/>
+        <w:numPr>
+          <w:ilvl w:val="0"/>
+          <w:numId w:val="2"/>
+        </w:numPr>
+        <w:spacing w:after="80" w:line="290"/>
+      </w:pPr>
+      <w:r>
+        <w:rPr>
+          <w:rFonts w:ascii="Calibri" w:cs="Calibri" w:eastAsia="Calibri" w:hAnsi="Calibri"/>
+          <w:b/>
+          <w:bCs/>
+          <w:sz w:val="21"/>
+          <w:szCs w:val="21"/>
+        </w:rPr>
+        <w:t xml:space="preserve">Screens in daily use. </w:t>
+      </w:r>
+      <w:r>
+        <w:rPr>
+          <w:rFonts w:ascii="Calibri" w:cs="Calibri" w:eastAsia="Calibri" w:hAnsi="Calibri"/>
+          <w:sz w:val="21"/>
+          <w:szCs w:val="21"/>
+        </w:rPr>
+        <w:t xml:space="preserve">Are there any current screens you or anyone else uses day to day that must not go away, even temporarily?</w:t>
+      </w:r>
+    </w:p>
+    <w:p>
+      <w:pPr>
+        <w:pStyle w:val="Heading1"/>
+        <w:spacing w:after="120" w:before="320"/>
+      </w:pPr>
+      <w:r>
+        <w:rPr>
+          <w:color w:val="081341"/>
+        </w:rPr>
+        <w:t xml:space="preserve">10. Services and accounts needed to go live</w:t>
       </w:r>
     </w:p>
     <w:p>

</xml_diff>